<commit_message>
Hill obituary: restore the 'I could not believe it' quotation to its paragraph
Co-Authored-By: Claude Sonnet 5.5 <noreply@anthropic.com>
</commit_message>
<xml_diff>
--- a/content-src/docx/O G 2016 07 01 Geoffrey Hill.docx
+++ b/content-src/docx/O G 2016 07 01 Geoffrey Hill.docx
@@ -162,7 +162,7 @@
         <w:t xml:space="preserve">At Oxford, he met the American poet Donald Hall, who told Hill that he was taking over the editorship of the Fantasy Poets and asked him to submit a manuscript. Later, Hall recalled receiving the poems: </w:t>
       </w:r>
       <w:r>
-        <w:t xml:space="preserve">&lt;quote&gt;</w:t>
+        <w:t xml:space="preserve">“</w:t>
       </w:r>
       <w:r>
         <w:t xml:space="preserve">I could not believe it. You can imagine reading these poems suddenly in </w:t>
@@ -171,7 +171,7 @@
         <w:t xml:space="preserve">1952. I read them and I was amazed. I remember waking up in the night, putting on the light and reading them again. Of course I published them.</w:t>
       </w:r>
       <w:r>
-        <w:t xml:space="preserve">&lt;/quote&gt;</w:t>
+        <w:t xml:space="preserve">”</w:t>
       </w:r>
     </w:p>
     <w:p>

</xml_diff>